<commit_message>
Fix E3/LI3: remove confession language, speed mention, and improve CTAs
- Replace "half a confession" with "the one most agencies won't bring up"
- Remove "speed" per Bonita's directive, use "research and the repetitive work"
- E3/LI3 CTA now offers brand audit first + call option, matching Bonita's direction

Co-Authored-By: Claude Opus 4.6 <noreply@anthropic.com>
Claude-Session: https://claude.ai/code/session_01WS6xuYeYiLyEA7jXRgr2tD
</commit_message>
<xml_diff>
--- a/OO_Manufacturing_Final_Copy.docx
+++ b/OO_Manufacturing_Final_Copy.docx
@@ -704,58 +704,58 @@
           <w:sz w:val="22"/>
           <w:szCs w:val="22"/>
         </w:rPr>
-        <w:t xml:space="preserve">One more thought, and it's half a confession.</w:t>
-      </w:r>
-    </w:p>
-    <w:p>
-      <w:pPr>
-        <w:spacing w:after="170"/>
-        <w:ind w:left="360"/>
-      </w:pPr>
-      <w:r>
-        <w:rPr>
-          <w:rFonts w:ascii="Calibri" w:cs="Calibri" w:eastAsia="Calibri" w:hAnsi="Calibri"/>
-          <w:i w:val="false"/>
-          <w:iCs w:val="false"/>
-          <w:color w:val="000000"/>
-          <w:sz w:val="22"/>
-          <w:szCs w:val="22"/>
-        </w:rPr>
-        <w:t xml:space="preserve">You've probably had a dozen emails like mine this week, and most of them weren't written by a person. Brand work has gone the same way. It comes back fast and it looks tidy, but it sounds like everyone else in the category.</w:t>
-      </w:r>
-    </w:p>
-    <w:p>
-      <w:pPr>
-        <w:spacing w:after="170"/>
-        <w:ind w:left="360"/>
-      </w:pPr>
-      <w:r>
-        <w:rPr>
-          <w:rFonts w:ascii="Calibri" w:cs="Calibri" w:eastAsia="Calibri" w:hAnsi="Calibri"/>
-          <w:i w:val="false"/>
-          <w:iCs w:val="false"/>
-          <w:color w:val="000000"/>
-          <w:sz w:val="22"/>
-          <w:szCs w:val="22"/>
-        </w:rPr>
-        <w:t xml:space="preserve">We use AI too, for the admin and the speed of it. The thinking still comes from people who've walked a factory floor and asked the awkward questions.</w:t>
-      </w:r>
-    </w:p>
-    <w:p>
-      <w:pPr>
-        <w:spacing w:after="170"/>
-        <w:ind w:left="360"/>
-      </w:pPr>
-      <w:r>
-        <w:rPr>
-          <w:rFonts w:ascii="Calibri" w:cs="Calibri" w:eastAsia="Calibri" w:hAnsi="Calibri"/>
-          <w:i w:val="false"/>
-          <w:iCs w:val="false"/>
-          <w:color w:val="000000"/>
-          <w:sz w:val="22"/>
-          <w:szCs w:val="22"/>
-        </w:rPr>
-        <w:t xml:space="preserve">If that sounds like something {{companyName}} needs, would you be open to a quick call?</w:t>
+        <w:t xml:space="preserve">One more thought — and it’s the one most agencies won’t bring up.</w:t>
+      </w:r>
+    </w:p>
+    <w:p>
+      <w:pPr>
+        <w:spacing w:after="170"/>
+        <w:ind w:left="360"/>
+      </w:pPr>
+      <w:r>
+        <w:rPr>
+          <w:rFonts w:ascii="Calibri" w:cs="Calibri" w:eastAsia="Calibri" w:hAnsi="Calibri"/>
+          <w:i w:val="false"/>
+          <w:iCs w:val="false"/>
+          <w:color w:val="000000"/>
+          <w:sz w:val="22"/>
+          <w:szCs w:val="22"/>
+        </w:rPr>
+        <w:t xml:space="preserve">You’ve probably had a dozen emails like mine this week, and most of them weren’t written by a person. Brand work has gone the same way. It comes back fast and it looks tidy, but it sounds like everyone else in the category.</w:t>
+      </w:r>
+    </w:p>
+    <w:p>
+      <w:pPr>
+        <w:spacing w:after="170"/>
+        <w:ind w:left="360"/>
+      </w:pPr>
+      <w:r>
+        <w:rPr>
+          <w:rFonts w:ascii="Calibri" w:cs="Calibri" w:eastAsia="Calibri" w:hAnsi="Calibri"/>
+          <w:i w:val="false"/>
+          <w:iCs w:val="false"/>
+          <w:color w:val="000000"/>
+          <w:sz w:val="22"/>
+          <w:szCs w:val="22"/>
+        </w:rPr>
+        <w:t xml:space="preserve">We use AI too, for the research and the repetitive work. The thinking still comes from people who’ve walked a factory floor and asked the awkward questions.</w:t>
+      </w:r>
+    </w:p>
+    <w:p>
+      <w:pPr>
+        <w:spacing w:after="170"/>
+        <w:ind w:left="360"/>
+      </w:pPr>
+      <w:r>
+        <w:rPr>
+          <w:rFonts w:ascii="Calibri" w:cs="Calibri" w:eastAsia="Calibri" w:hAnsi="Calibri"/>
+          <w:i w:val="false"/>
+          <w:iCs w:val="false"/>
+          <w:color w:val="000000"/>
+          <w:sz w:val="22"/>
+          <w:szCs w:val="22"/>
+        </w:rPr>
+        <w:t xml:space="preserve">If that matters at {{companyName}}, I’m happy to send you the brand audit — or we can jump straight to a call if you’d prefer.</w:t>
       </w:r>
     </w:p>
     <w:p>
@@ -1435,58 +1435,58 @@
           <w:sz w:val="22"/>
           <w:szCs w:val="22"/>
         </w:rPr>
-        <w:t xml:space="preserve">One more thought, and it's half a confession.</w:t>
-      </w:r>
-    </w:p>
-    <w:p>
-      <w:pPr>
-        <w:spacing w:after="170"/>
-        <w:ind w:left="360"/>
-      </w:pPr>
-      <w:r>
-        <w:rPr>
-          <w:rFonts w:ascii="Calibri" w:cs="Calibri" w:eastAsia="Calibri" w:hAnsi="Calibri"/>
-          <w:i w:val="false"/>
-          <w:iCs w:val="false"/>
-          <w:color w:val="000000"/>
-          <w:sz w:val="22"/>
-          <w:szCs w:val="22"/>
-        </w:rPr>
-        <w:t xml:space="preserve">You've probably had a dozen messages like mine this week, and most of them weren't written by a person. Brand work has gone the same way. It comes back fast and it looks tidy, but it sounds like everyone else in the category.</w:t>
-      </w:r>
-    </w:p>
-    <w:p>
-      <w:pPr>
-        <w:spacing w:after="170"/>
-        <w:ind w:left="360"/>
-      </w:pPr>
-      <w:r>
-        <w:rPr>
-          <w:rFonts w:ascii="Calibri" w:cs="Calibri" w:eastAsia="Calibri" w:hAnsi="Calibri"/>
-          <w:i w:val="false"/>
-          <w:iCs w:val="false"/>
-          <w:color w:val="000000"/>
-          <w:sz w:val="22"/>
-          <w:szCs w:val="22"/>
-        </w:rPr>
-        <w:t xml:space="preserve">We use AI too, for the admin and the speed of it. The thinking still comes from people who've walked a factory floor and asked the awkward questions.</w:t>
-      </w:r>
-    </w:p>
-    <w:p>
-      <w:pPr>
-        <w:spacing w:after="170"/>
-        <w:ind w:left="360"/>
-      </w:pPr>
-      <w:r>
-        <w:rPr>
-          <w:rFonts w:ascii="Calibri" w:cs="Calibri" w:eastAsia="Calibri" w:hAnsi="Calibri"/>
-          <w:i w:val="false"/>
-          <w:iCs w:val="false"/>
-          <w:color w:val="000000"/>
-          <w:sz w:val="22"/>
-          <w:szCs w:val="22"/>
-        </w:rPr>
-        <w:t xml:space="preserve">If that sounds like something {{companyName}} needs, would you be open to a quick call?</w:t>
+        <w:t xml:space="preserve">One more thought — and it’s the one most agencies won’t bring up.</w:t>
+      </w:r>
+    </w:p>
+    <w:p>
+      <w:pPr>
+        <w:spacing w:after="170"/>
+        <w:ind w:left="360"/>
+      </w:pPr>
+      <w:r>
+        <w:rPr>
+          <w:rFonts w:ascii="Calibri" w:cs="Calibri" w:eastAsia="Calibri" w:hAnsi="Calibri"/>
+          <w:i w:val="false"/>
+          <w:iCs w:val="false"/>
+          <w:color w:val="000000"/>
+          <w:sz w:val="22"/>
+          <w:szCs w:val="22"/>
+        </w:rPr>
+        <w:t xml:space="preserve">You’ve probably had a dozen messages like mine this week, and most of them weren’t written by a person. Brand work has gone the same way. It comes back fast and it looks tidy, but it sounds like everyone else in the category.</w:t>
+      </w:r>
+    </w:p>
+    <w:p>
+      <w:pPr>
+        <w:spacing w:after="170"/>
+        <w:ind w:left="360"/>
+      </w:pPr>
+      <w:r>
+        <w:rPr>
+          <w:rFonts w:ascii="Calibri" w:cs="Calibri" w:eastAsia="Calibri" w:hAnsi="Calibri"/>
+          <w:i w:val="false"/>
+          <w:iCs w:val="false"/>
+          <w:color w:val="000000"/>
+          <w:sz w:val="22"/>
+          <w:szCs w:val="22"/>
+        </w:rPr>
+        <w:t xml:space="preserve">We use AI too, for the research and the repetitive work. The thinking still comes from people who’ve walked a factory floor and asked the awkward questions.</w:t>
+      </w:r>
+    </w:p>
+    <w:p>
+      <w:pPr>
+        <w:spacing w:after="170"/>
+        <w:ind w:left="360"/>
+      </w:pPr>
+      <w:r>
+        <w:rPr>
+          <w:rFonts w:ascii="Calibri" w:cs="Calibri" w:eastAsia="Calibri" w:hAnsi="Calibri"/>
+          <w:i w:val="false"/>
+          <w:iCs w:val="false"/>
+          <w:color w:val="000000"/>
+          <w:sz w:val="22"/>
+          <w:szCs w:val="22"/>
+        </w:rPr>
+        <w:t xml:space="preserve">If that matters at {{companyName}}, I’m happy to send you the brand audit — or we can jump straight to a call if you’d prefer.</w:t>
       </w:r>
     </w:p>
     <w:p>

</xml_diff>

<commit_message>
Align CTAs with Bonita/Dylan meeting direction + use Bonita's positioning
- Replace made-up "10-question brand audit" with personalized flash
  audit + one-pager CTA (per Aug 17 meeting with Bonita & Dylan)
- E2/LI2 CTA: "I've run a quick brand audit on {{companyName}}"
- E3/LI3 AI line uses Bonita's own words: "uncluttered, intuitive,
  genuinely yours" + "the part a machine can't carry"
- All CTAs now reference the specific one-pager deliverable
- No spintax in this version

Co-Authored-By: Claude Opus 4.6 <noreply@anthropic.com>
Claude-Session: https://claude.ai/code/session_01WS6xuYeYiLyEA7jXRgr2tD
</commit_message>
<xml_diff>
--- a/OO_Manufacturing_Final_Copy.docx
+++ b/OO_Manufacturing_Final_Copy.docx
@@ -232,24 +232,24 @@
           <w:sz w:val="22"/>
           <w:szCs w:val="22"/>
         </w:rPr>
-        <w:t xml:space="preserve">We do brand and positioning work for manufacturers, so I'll get straight to it.</w:t>
-      </w:r>
-    </w:p>
-    <w:p>
-      <w:pPr>
-        <w:spacing w:after="170"/>
-        <w:ind w:left="360"/>
-      </w:pPr>
-      <w:r>
-        <w:rPr>
-          <w:rFonts w:ascii="Calibri" w:cs="Calibri" w:eastAsia="Calibri" w:hAnsi="Calibri"/>
-          <w:i w:val="false"/>
-          <w:iCs w:val="false"/>
-          <w:color w:val="000000"/>
-          <w:sz w:val="22"/>
-          <w:szCs w:val="22"/>
-        </w:rPr>
-        <w:t xml:space="preserve">Most of the companies we meet have outgrown the way they look to the market. The business has moved on. The brand hasn't quite caught up. Where you feel it is in the quotes you lose on price, and in buyers who treat you as interchangeable with the supplier down the road.</w:t>
+        <w:t xml:space="preserve">We do brand and positioning work for manufacturers, so I’ll get straight to it.</w:t>
+      </w:r>
+    </w:p>
+    <w:p>
+      <w:pPr>
+        <w:spacing w:after="170"/>
+        <w:ind w:left="360"/>
+      </w:pPr>
+      <w:r>
+        <w:rPr>
+          <w:rFonts w:ascii="Calibri" w:cs="Calibri" w:eastAsia="Calibri" w:hAnsi="Calibri"/>
+          <w:i w:val="false"/>
+          <w:iCs w:val="false"/>
+          <w:color w:val="000000"/>
+          <w:sz w:val="22"/>
+          <w:szCs w:val="22"/>
+        </w:rPr>
+        <w:t xml:space="preserve">Most of the companies we meet have outgrown the way they look to the market. The business has moved on. The brand hasn’t quite caught up. Where you feel it is in the quotes you lose on price, and in buyers who treat you as interchangeable with the supplier down the road.</w:t>
       </w:r>
     </w:p>
     <w:p>
@@ -271,7 +271,7 @@
           <w:sz w:val="22"/>
           <w:szCs w:val="22"/>
         </w:rPr>
-        <w:t xml:space="preserve">That's what we fix at Outlook Orange:</w:t>
+        <w:t xml:space="preserve">That’s what we fix at Outlook Orange:</w:t>
       </w:r>
     </w:p>
     <w:p>
@@ -453,7 +453,7 @@
           <w:sz w:val="22"/>
           <w:szCs w:val="22"/>
         </w:rPr>
-        <w:t xml:space="preserve">P.S. If a call feels premature, I can send you our free 10-question brand audit first. It takes ten minutes and shows you where the brand sits today.</w:t>
+        <w:t xml:space="preserve">P.S. If a call feels premature, I’ve put together a short brand read on {{companyName}} — a few spots where what you’re saying as a business may not match how the market reads you. Happy to send over the one-pager.</w:t>
       </w:r>
     </w:p>
     <w:p>
@@ -553,7 +553,7 @@
           <w:sz w:val="22"/>
           <w:szCs w:val="22"/>
         </w:rPr>
-        <w:t xml:space="preserve">NUVO Rubber came to us thirteen years ago. They knew they wanted a rebrand. What they couldn't say was what it was supposed to do for the business.</w:t>
+        <w:t xml:space="preserve">NUVO Rubber came to us thirteen years ago. They knew they wanted a rebrand. What they couldn’t say was what it was supposed to do for the business.</w:t>
       </w:r>
     </w:p>
     <w:p>
@@ -587,24 +587,24 @@
           <w:sz w:val="22"/>
           <w:szCs w:val="22"/>
         </w:rPr>
-        <w:t xml:space="preserve">They're still with us. That's the part I'd point to, not the rebrand. Plenty of agencies can redraw a logo. Keeping a manufacturer relevant through thirteen years of a shifting market is the harder job.</w:t>
-      </w:r>
-    </w:p>
-    <w:p>
-      <w:pPr>
-        <w:spacing w:after="170"/>
-        <w:ind w:left="360"/>
-      </w:pPr>
-      <w:r>
-        <w:rPr>
-          <w:rFonts w:ascii="Calibri" w:cs="Calibri" w:eastAsia="Calibri" w:hAnsi="Calibri"/>
-          <w:i w:val="false"/>
-          <w:iCs w:val="false"/>
-          <w:color w:val="000000"/>
-          <w:sz w:val="22"/>
-          <w:szCs w:val="22"/>
-        </w:rPr>
-        <w:t xml:space="preserve">Want me to send you the brand audit so you can see where {{companyName}} sits?</w:t>
+        <w:t xml:space="preserve">They’re still with us. That’s the part I’d point to, not the rebrand. Plenty of agencies can redraw a logo. Keeping a manufacturer relevant through thirteen years of a shifting market is the harder job.</w:t>
+      </w:r>
+    </w:p>
+    <w:p>
+      <w:pPr>
+        <w:spacing w:after="170"/>
+        <w:ind w:left="360"/>
+      </w:pPr>
+      <w:r>
+        <w:rPr>
+          <w:rFonts w:ascii="Calibri" w:cs="Calibri" w:eastAsia="Calibri" w:hAnsi="Calibri"/>
+          <w:i w:val="false"/>
+          <w:iCs w:val="false"/>
+          <w:color w:val="000000"/>
+          <w:sz w:val="22"/>
+          <w:szCs w:val="22"/>
+        </w:rPr>
+        <w:t xml:space="preserve">I’ve run a quick brand audit on {{companyName}} and spotted a couple of things worth a look. Want me to send it across?</w:t>
       </w:r>
     </w:p>
     <w:p>
@@ -738,24 +738,24 @@
           <w:sz w:val="22"/>
           <w:szCs w:val="22"/>
         </w:rPr>
-        <w:t xml:space="preserve">We use AI too, for the research and the repetitive work. The thinking still comes from people who’ve walked a factory floor and asked the awkward questions.</w:t>
-      </w:r>
-    </w:p>
-    <w:p>
-      <w:pPr>
-        <w:spacing w:after="170"/>
-        <w:ind w:left="360"/>
-      </w:pPr>
-      <w:r>
-        <w:rPr>
-          <w:rFonts w:ascii="Calibri" w:cs="Calibri" w:eastAsia="Calibri" w:hAnsi="Calibri"/>
-          <w:i w:val="false"/>
-          <w:iCs w:val="false"/>
-          <w:color w:val="000000"/>
-          <w:sz w:val="22"/>
-          <w:szCs w:val="22"/>
-        </w:rPr>
-        <w:t xml:space="preserve">If that matters at {{companyName}}, I’m happy to send you the brand audit — or we can jump straight to a call if you’d prefer.</w:t>
+        <w:t xml:space="preserve">We use AI too, for the research and the routine work. The thinking — the part that makes a brand feel uncluttered, intuitive, and genuinely yours — still comes from people who’ve walked a factory floor and asked the awkward questions. That’s the part a machine can’t carry.</w:t>
+      </w:r>
+    </w:p>
+    <w:p>
+      <w:pPr>
+        <w:spacing w:after="170"/>
+        <w:ind w:left="360"/>
+      </w:pPr>
+      <w:r>
+        <w:rPr>
+          <w:rFonts w:ascii="Calibri" w:cs="Calibri" w:eastAsia="Calibri" w:hAnsi="Calibri"/>
+          <w:i w:val="false"/>
+          <w:iCs w:val="false"/>
+          <w:color w:val="000000"/>
+          <w:sz w:val="22"/>
+          <w:szCs w:val="22"/>
+        </w:rPr>
+        <w:t xml:space="preserve">If that matters at {{companyName}}, I’m happy to send over the one-pager from the brand audit I put together — or we can jump straight to a call if you’d prefer.</w:t>
       </w:r>
     </w:p>
     <w:p>
@@ -789,7 +789,7 @@
           <w:sz w:val="22"/>
           <w:szCs w:val="22"/>
         </w:rPr>
-        <w:t xml:space="preserve">P.S. And if I've misread {{companyName}} entirely, say so and I'll stop.</w:t>
+        <w:t xml:space="preserve">P.S. And if I’ve misread {{companyName}} entirely, say so and I’ll stop.</w:t>
       </w:r>
     </w:p>
     <w:p>
@@ -906,7 +906,7 @@
           <w:sz w:val="22"/>
           <w:szCs w:val="22"/>
         </w:rPr>
-        <w:t xml:space="preserve">If one of those is live at {{companyName}}, I'd welcome half an hour this week or next. Whether we work together or not, you'll leave with a clearer picture of where the brand sits.</w:t>
+        <w:t xml:space="preserve">If one of those is live at {{companyName}}, I’d welcome half an hour this week or next. Whether we work together or not, you’ll leave with a clearer picture of where the brand sits.</w:t>
       </w:r>
     </w:p>
     <w:p>
@@ -957,7 +957,7 @@
           <w:sz w:val="22"/>
           <w:szCs w:val="22"/>
         </w:rPr>
-        <w:t xml:space="preserve">P.S. I won't keep following up. If it comes up later, you know where I am.</w:t>
+        <w:t xml:space="preserve">P.S. I won’t keep following up. If it comes up later, you know where I am.</w:t>
       </w:r>
     </w:p>
     <w:p>
@@ -1036,24 +1036,24 @@
           <w:sz w:val="22"/>
           <w:szCs w:val="22"/>
         </w:rPr>
-        <w:t xml:space="preserve">We work with manufacturers on brand and positioning. I'll keep this short.</w:t>
-      </w:r>
-    </w:p>
-    <w:p>
-      <w:pPr>
-        <w:spacing w:after="170"/>
-        <w:ind w:left="360"/>
-      </w:pPr>
-      <w:r>
-        <w:rPr>
-          <w:rFonts w:ascii="Calibri" w:cs="Calibri" w:eastAsia="Calibri" w:hAnsi="Calibri"/>
-          <w:i w:val="false"/>
-          <w:iCs w:val="false"/>
-          <w:color w:val="000000"/>
-          <w:sz w:val="22"/>
-          <w:szCs w:val="22"/>
-        </w:rPr>
-        <w:t xml:space="preserve">Most of the companies we meet have outgrown the way they look to the market. The business has moved on. The brand hasn't quite caught up. Where it shows is in quotes lost on price, and buyers who treat you as interchangeable with the supplier down the road.</w:t>
+        <w:t xml:space="preserve">We work with manufacturers on brand and positioning. I’ll keep this short.</w:t>
+      </w:r>
+    </w:p>
+    <w:p>
+      <w:pPr>
+        <w:spacing w:after="170"/>
+        <w:ind w:left="360"/>
+      </w:pPr>
+      <w:r>
+        <w:rPr>
+          <w:rFonts w:ascii="Calibri" w:cs="Calibri" w:eastAsia="Calibri" w:hAnsi="Calibri"/>
+          <w:i w:val="false"/>
+          <w:iCs w:val="false"/>
+          <w:color w:val="000000"/>
+          <w:sz w:val="22"/>
+          <w:szCs w:val="22"/>
+        </w:rPr>
+        <w:t xml:space="preserve">Most of the companies we meet have outgrown the way they look to the market. The business has moved on. The brand hasn’t quite caught up. Where it shows is in quotes lost on price, and buyers who treat you as interchangeable with the supplier down the road.</w:t>
       </w:r>
     </w:p>
     <w:p>
@@ -1075,7 +1075,7 @@
           <w:sz w:val="22"/>
           <w:szCs w:val="22"/>
         </w:rPr>
-        <w:t xml:space="preserve">That's what we fix at Outlook Orange:</w:t>
+        <w:t xml:space="preserve">That’s what we fix at Outlook Orange:</w:t>
       </w:r>
     </w:p>
     <w:p>
@@ -1346,24 +1346,24 @@
           <w:sz w:val="22"/>
           <w:szCs w:val="22"/>
         </w:rPr>
-        <w:t xml:space="preserve">Most of our clients arrive the same way. It's rarely a crisis. More a sense that the business has moved on and the brand hasn't quite kept up.</w:t>
-      </w:r>
-    </w:p>
-    <w:p>
-      <w:pPr>
-        <w:spacing w:after="170"/>
-        <w:ind w:left="360"/>
-      </w:pPr>
-      <w:r>
-        <w:rPr>
-          <w:rFonts w:ascii="Calibri" w:cs="Calibri" w:eastAsia="Calibri" w:hAnsi="Calibri"/>
-          <w:i w:val="false"/>
-          <w:iCs w:val="false"/>
-          <w:color w:val="000000"/>
-          <w:sz w:val="22"/>
-          <w:szCs w:val="22"/>
-        </w:rPr>
-        <w:t xml:space="preserve">Does any of that sound familiar at {{companyName}}?</w:t>
+        <w:t xml:space="preserve">Most of our clients arrive the same way. It’s rarely a crisis. More a sense that the business has moved on and the brand hasn’t quite kept up.</w:t>
+      </w:r>
+    </w:p>
+    <w:p>
+      <w:pPr>
+        <w:spacing w:after="170"/>
+        <w:ind w:left="360"/>
+      </w:pPr>
+      <w:r>
+        <w:rPr>
+          <w:rFonts w:ascii="Calibri" w:cs="Calibri" w:eastAsia="Calibri" w:hAnsi="Calibri"/>
+          <w:i w:val="false"/>
+          <w:iCs w:val="false"/>
+          <w:color w:val="000000"/>
+          <w:sz w:val="22"/>
+          <w:szCs w:val="22"/>
+        </w:rPr>
+        <w:t xml:space="preserve">I’ve put together a short brand read on {{companyName}} — happy to send it across if any of that sounds familiar.</w:t>
       </w:r>
     </w:p>
     <w:p>
@@ -1469,24 +1469,24 @@
           <w:sz w:val="22"/>
           <w:szCs w:val="22"/>
         </w:rPr>
-        <w:t xml:space="preserve">We use AI too, for the research and the repetitive work. The thinking still comes from people who’ve walked a factory floor and asked the awkward questions.</w:t>
-      </w:r>
-    </w:p>
-    <w:p>
-      <w:pPr>
-        <w:spacing w:after="170"/>
-        <w:ind w:left="360"/>
-      </w:pPr>
-      <w:r>
-        <w:rPr>
-          <w:rFonts w:ascii="Calibri" w:cs="Calibri" w:eastAsia="Calibri" w:hAnsi="Calibri"/>
-          <w:i w:val="false"/>
-          <w:iCs w:val="false"/>
-          <w:color w:val="000000"/>
-          <w:sz w:val="22"/>
-          <w:szCs w:val="22"/>
-        </w:rPr>
-        <w:t xml:space="preserve">If that matters at {{companyName}}, I’m happy to send you the brand audit — or we can jump straight to a call if you’d prefer.</w:t>
+        <w:t xml:space="preserve">We use AI too, for the research and the routine work. The thinking — the part that makes a brand feel uncluttered, intuitive, and genuinely yours — still comes from people who’ve walked a factory floor and asked the awkward questions. That’s the part a machine can’t carry.</w:t>
+      </w:r>
+    </w:p>
+    <w:p>
+      <w:pPr>
+        <w:spacing w:after="170"/>
+        <w:ind w:left="360"/>
+      </w:pPr>
+      <w:r>
+        <w:rPr>
+          <w:rFonts w:ascii="Calibri" w:cs="Calibri" w:eastAsia="Calibri" w:hAnsi="Calibri"/>
+          <w:i w:val="false"/>
+          <w:iCs w:val="false"/>
+          <w:color w:val="000000"/>
+          <w:sz w:val="22"/>
+          <w:szCs w:val="22"/>
+        </w:rPr>
+        <w:t xml:space="preserve">If that matters at {{companyName}}, I’m happy to send over the one-pager from the brand audit I put together — or we can jump straight to a call if you’d prefer.</w:t>
       </w:r>
     </w:p>
     <w:p>
@@ -1558,24 +1558,24 @@
           <w:sz w:val="22"/>
           <w:szCs w:val="22"/>
         </w:rPr>
-        <w:t xml:space="preserve">If the timing's wrong, that's genuinely fine and I won't keep nudging.</w:t>
-      </w:r>
-    </w:p>
-    <w:p>
-      <w:pPr>
-        <w:spacing w:after="170"/>
-        <w:ind w:left="360"/>
-      </w:pPr>
-      <w:r>
-        <w:rPr>
-          <w:rFonts w:ascii="Calibri" w:cs="Calibri" w:eastAsia="Calibri" w:hAnsi="Calibri"/>
-          <w:i w:val="false"/>
-          <w:iCs w:val="false"/>
-          <w:color w:val="000000"/>
-          <w:sz w:val="22"/>
-          <w:szCs w:val="22"/>
-        </w:rPr>
-        <w:t xml:space="preserve">If it isn't, there are two easy ways in. We have a free 10-question brand audit that shows where a business stands. It takes about ten minutes and I'll happily send it across. Or I'll give you half an hour and you can ask whatever you want.</w:t>
+        <w:t xml:space="preserve">If the timing’s wrong, that’s genuinely fine and I won’t keep nudging.</w:t>
+      </w:r>
+    </w:p>
+    <w:p>
+      <w:pPr>
+        <w:spacing w:after="170"/>
+        <w:ind w:left="360"/>
+      </w:pPr>
+      <w:r>
+        <w:rPr>
+          <w:rFonts w:ascii="Calibri" w:cs="Calibri" w:eastAsia="Calibri" w:hAnsi="Calibri"/>
+          <w:i w:val="false"/>
+          <w:iCs w:val="false"/>
+          <w:color w:val="000000"/>
+          <w:sz w:val="22"/>
+          <w:szCs w:val="22"/>
+        </w:rPr>
+        <w:t xml:space="preserve">If it isn’t, there are two easy ways in. I’ve put together a short brand audit on {{companyName}} — a one-pager that shows where you sit today. Or I’ll give you half an hour and you can ask whatever you want.</w:t>
       </w:r>
     </w:p>
     <w:p>

</xml_diff>